<commit_message>
testing and added verconcia updated resume that auto downloaded
</commit_message>
<xml_diff>
--- a/Resume - Veronica Hawkes_updated.docx
+++ b/Resume - Veronica Hawkes_updated.docx
@@ -26,7 +26,7 @@
         </w:rPr>
       </w:pPr>
       <w:r>
-        <w:t xml:space="preserve">9 years of experience in Client-Facing Roles and Business Analysis </w:t>
+        <w:t xml:space="preserve">9 years of experience in Business Analysis and Operational Excellence </w:t>
       </w:r>
     </w:p>
     <w:p>
@@ -53,13 +53,13 @@
         </w:rPr>
       </w:pPr>
       <w:r>
-        <w:t>Veronica Hawkes is a highly driven and accomplished professional with over nine years of experience in client-facing roles, excelling in analytical problem-solving, leadership, and interpersonal communication. She is currently pursuing her Master of Business Administration in Enterprise Analytics at Dalhousie University, where she is honing her skills in advanced data analysis and strategic decision-making. With a Bachelor of Science in Human Kinetics from St. Francis Xavier University, Veronica combines a unique blend of technical knowledge and a human-centered approach to problem-solving, making her a versatile and effective contributor in dynamic environments.</w:t>
+        <w:t>Veronica Hawkes is a highly driven and results-oriented professional with over nine years of client-facing experience, excelling in analytical problem-solving, leadership, and teamwork. She holds a Bachelor of Science in Human Kinetics from St. Francis Xavier University and is pursuing a Master of Business Administration in Enterprise Analytics at Dalhousie University, set to graduate in May 2024. Her academic background, combined with hands-on experience in business analysis and operational excellence, has equipped her with a unique blend of technical expertise and interpersonal skills. Veronica has consistently demonstrated her ability to adapt and thrive in fast-paced environments, leveraging her financial and analytical knowledge to deliver impactful solutions for organizations.</w:t>
         <w:br/>
         <w:br/>
-        <w:t>In her professional career, Veronica has demonstrated exceptional ability to adapt and lead in diverse roles. As a Business Analyst and Project Coordinator at CGI, she has utilized her technical expertise to document business processes, create future-state blueprints, and deliver actionable recommendations that enhance operational efficiency. Previously, during her tenure as an Operational &amp; Service Excellence Intern with the Government of Nova Scotia, she facilitated large-scale process improvement initiatives, developed standardized procedures, and leveraged tools such as Power BI, Power Automate, and Excel to improve data analytics and team collaboration. Her background also includes financial expertise as a Cash Balancer at Canadian Tire, where she ensured accurate cash flow management, and extensive customer service experience, which further strengthened her problem-solving and organizational skills.</w:t>
+        <w:t>In her current role as a Business Analyst and Project Coordinator at CGI, Veronica has been instrumental in enhancing operational efficiency through process documentation, actionable insights, and future-state recommendations. Her exceptional analytical skills, coupled with proficiency in tools like Excel, PowerPoint, and Power BI, have enabled her to produce comprehensive reports and visual dashboards that improve stakeholder communication and decision-making. Prior to this, her internship with the Government of Nova Scotia showcased her expertise in business process improvement and Lean Six Sigma methodologies. Veronica successfully developed and delivered virtual trainings for over 230 participants, built standard operating procedures, and organized major events while implementing innovative systems to boost team efficiency. Her early career roles at Canadian Tire further highlight her ability to balance financial responsibilities, provide exceptional customer service, and train incoming staff, earning her recognition for her reliability and organizational capabilities.</w:t>
         <w:br/>
         <w:br/>
-        <w:t>Veronica’s technical proficiency is complemented by a robust set of certifications, including Lean Six Sigma Green Belt, Certified SAFe 6 Practitioner, and the SAP Student Recognition Award. She is proficient in tools such as Tableau, SAP, Power Automate, and Excel, which she employs to drive data-driven insights and streamline processes. Veronica’s combination of academic excellence, professional expertise, and commitment to continuous improvement positions her as a dynamic professional ready to tackle complex challenges and deliver impactful results in any organization..</w:t>
+        <w:t>Veronica’s technical proficiency spans Tableau, SAP, Power Automate, and MS Teams, complemented by her certifications as a Lean Six Sigma Green Belt, Lean Six Sigma Yellow Belt, and Certified SAFe 6 Practitioner. Additionally, she holds the SAP Student Recognition Award from Dalhousie University, underscoring her commitment to continuous learning and professional development. Veronica’s transformative impact on organizations, coupled with her strong leadership and communication skills, positions her as an invaluable asset in driving operational excellence and delivering data-driven solutions. Her ability to synthesize technical knowledge with strategic thinking ensures that she not only meets but exceeds organizational objectives, making her a standout professional in enterprise analytics and process optimization..</w:t>
       </w:r>
     </w:p>
     <w:bookmarkEnd w:id="0"/>
@@ -87,7 +87,7 @@
         </w:rPr>
       </w:pPr>
       <w:r>
-        <w:t>Documented current state business processes to identify operational efficiencies.</w:t>
+        <w:t>Documented current state business processes to identify operational efficiency opportunities.</w:t>
       </w:r>
     </w:p>
     <w:p>
@@ -95,7 +95,7 @@
         <w:pStyle w:val="ListBullet"/>
       </w:pPr>
       <w:r>
-        <w:t>Applied analytical skills to derive actionable insights for project analysis.</w:t>
+        <w:t>Applied advanced analytical skills to derive actionable insights and improve decision-making.</w:t>
       </w:r>
     </w:p>
     <w:p>
@@ -103,7 +103,7 @@
         <w:pStyle w:val="ListBullet"/>
       </w:pPr>
       <w:r>
-        <w:t>Drafted future-state recommendations, including streamlined processes and operational improvements.</w:t>
+        <w:t>Drafted future-state recommendations, including streamlined processes and customer journey maps.</w:t>
       </w:r>
     </w:p>
     <w:p>
@@ -111,7 +111,7 @@
         <w:pStyle w:val="ListBullet"/>
       </w:pPr>
       <w:r>
-        <w:t>Produced detailed reports using Excel and PowerPoint to enhance stakeholder communication.</w:t>
+        <w:t>Created comprehensive reports using Excel and PowerPoint to enhance stakeholder communication.</w:t>
       </w:r>
     </w:p>
     <w:p>
@@ -119,7 +119,7 @@
         <w:pStyle w:val="ListBullet"/>
       </w:pPr>
       <w:r>
-        <w:t>Created implementation plans with organizational structure, roles, and costs.</w:t>
+        <w:t>Developed future state blueprints and implementation plans, detailing organizational structures and costs.</w:t>
       </w:r>
     </w:p>
     <w:p>
@@ -127,7 +127,7 @@
         <w:pStyle w:val="ListBullet"/>
       </w:pPr>
       <w:r>
-        <w:t>Coordinated tasks, schedules, and resources to ensure project success.</w:t>
+        <w:t>Coordinated tasks, schedules, and resources to ensure project success within scope.</w:t>
       </w:r>
     </w:p>
     <w:p>
@@ -156,7 +156,7 @@
         <w:ind w:left="360" w:hanging="360"/>
       </w:pPr>
       <w:r>
-        <w:t>Ensured financial documents reflected accurate cash flow information.</w:t>
+        <w:t>Ensured financial documents accurately reflected cash flow information.</w:t>
       </w:r>
     </w:p>
     <w:p>
@@ -164,7 +164,7 @@
         <w:pStyle w:val="ListBullet"/>
       </w:pPr>
       <w:r>
-        <w:t>Utilized finance knowledge from coursework to interpret financial statements.</w:t>
+        <w:t>Interpreted financial documents using knowledge from finance and financial statement courses.</w:t>
       </w:r>
     </w:p>
     <w:p>
@@ -172,7 +172,7 @@
         <w:pStyle w:val="ListBullet"/>
       </w:pPr>
       <w:r>
-        <w:t>Allocated funds to develop accurate bank deposits.</w:t>
+        <w:t>Allocated funds to develop bank deposits.</w:t>
       </w:r>
     </w:p>
     <w:p>
@@ -188,7 +188,7 @@
         <w:pStyle w:val="ListBullet"/>
       </w:pPr>
       <w:r>
-        <w:t>Produced virtual programs, services, and trainings for over 230 participants.</w:t>
+        <w:t>Produced programs, services, and trainings for 230+ participants virtually using MS Teams, Power Automate, Excel, and Outlook.</w:t>
       </w:r>
     </w:p>
     <w:p>
@@ -196,7 +196,7 @@
         <w:pStyle w:val="ListBullet"/>
       </w:pPr>
       <w:r>
-        <w:t>Led team meetings to identify organizational barriers using periodic management.</w:t>
+        <w:t>Facilitated team meetings to identify organizational barriers and improve workflows.</w:t>
       </w:r>
     </w:p>
     <w:p>
@@ -204,7 +204,7 @@
         <w:pStyle w:val="ListBullet"/>
       </w:pPr>
       <w:r>
-        <w:t>Developed standard operating procedures for consistent service delivery.</w:t>
+        <w:t>Created standard operating procedures to ensure uniform operations for services and events.</w:t>
       </w:r>
     </w:p>
     <w:p>
@@ -212,7 +212,7 @@
         <w:pStyle w:val="ListBullet"/>
       </w:pPr>
       <w:r>
-        <w:t>Improved team data analytics by creating Power BI dashboards.</w:t>
+        <w:t>Oversaw business process improvement training programs, including Lean Six Sigma certifications.</w:t>
       </w:r>
     </w:p>
     <w:p>
@@ -220,7 +220,7 @@
         <w:pStyle w:val="ListBullet"/>
       </w:pPr>
       <w:r>
-        <w:t>Supported Lean Six Sigma Yellow Belt Certification for government staff.</w:t>
+        <w:t>Developed Power BI dashboards to enhance data analytics and visualization.</w:t>
       </w:r>
     </w:p>
     <w:p>
@@ -228,15 +228,7 @@
         <w:pStyle w:val="ListBullet"/>
       </w:pPr>
       <w:r>
-        <w:t>Collaborated in planning an event for over 70 attendees.</w:t>
-      </w:r>
-    </w:p>
-    <w:p>
-      <w:pPr>
-        <w:pStyle w:val="ListBullet"/>
-      </w:pPr>
-      <w:r>
-        <w:t>Implemented a 5S organizational system to enhance team efficiency.</w:t>
+        <w:t>Coordinated major events for 70+ attendees and implemented 5S methodology to improve team efficiency.</w:t>
       </w:r>
     </w:p>
     <w:p>
@@ -252,7 +244,7 @@
         <w:pStyle w:val="ListBullet"/>
       </w:pPr>
       <w:r>
-        <w:t>Resolved customer inquiries and complaints effectively in a fast-paced environment.</w:t>
+        <w:t>Developed communication, conflict resolution, and organizational skills while triaging customer inquiries.</w:t>
       </w:r>
     </w:p>
     <w:p>
@@ -260,7 +252,7 @@
         <w:pStyle w:val="ListBullet"/>
       </w:pPr>
       <w:r>
-        <w:t>Delivered exceptional customer service to address diverse needs.</w:t>
+        <w:t>Provided exceptional service in a fast-paced environment, handling diverse customer needs.</w:t>
       </w:r>
     </w:p>
     <w:p>
@@ -268,7 +260,7 @@
         <w:pStyle w:val="ListBullet"/>
       </w:pPr>
       <w:r>
-        <w:t>Handled cash transactions and prepared registers for store opening.</w:t>
+        <w:t>Managed cash handling and prepared registers for store operations.</w:t>
       </w:r>
     </w:p>
     <w:p>
@@ -276,7 +268,7 @@
         <w:pStyle w:val="ListBullet"/>
       </w:pPr>
       <w:r>
-        <w:t>Trained new employees on store policies and processes.</w:t>
+        <w:t>Trained new employees on store policies and technology.</w:t>
       </w:r>
     </w:p>
     <w:p>
@@ -284,7 +276,7 @@
         <w:pStyle w:val="ListBullet"/>
       </w:pPr>
       <w:r>
-        <w:t>Managed staffing schedules for up to 8 cashiers per shift.</w:t>
+        <w:t>Organized staffing allocation for up to 8 cashiers per shift, optimizing schedules.</w:t>
       </w:r>
     </w:p>
     <w:p>
@@ -292,7 +284,7 @@
         <w:pStyle w:val="ListBullet"/>
       </w:pPr>
       <w:r>
-        <w:t>Developed organizational and problem-solving skills across various departments.</w:t>
+        <w:t>Worked across departments to develop problem-solving and organizational expertise.</w:t>
       </w:r>
     </w:p>
     <w:p>
@@ -316,7 +308,7 @@
         </w:rPr>
       </w:pPr>
       <w:r>
-        <w:t>Master of Business Administration, Enterprise Analytics - Dalhousie University</w:t>
+        <w:t>Master of Business Administration, Enterprise Analytics, Dalhousie University</w:t>
       </w:r>
     </w:p>
     <w:p>
@@ -324,7 +316,7 @@
         <w:pStyle w:val="ListBullet"/>
       </w:pPr>
       <w:r>
-        <w:t>Bachelor of Science, Human Kinetics - St. Francis Xavier University</w:t>
+        <w:t>Bachelor of Science, Human Kinetics, St. Francis Xavier University</w:t>
       </w:r>
     </w:p>
     <w:p>
@@ -422,7 +414,7 @@
               <w:ind w:left="360" w:hanging="360"/>
             </w:pPr>
             <w:r>
-              <w:t>Information Technology (IT) Services</w:t>
+              <w:t>Information Technology (IT) Consulting</w:t>
             </w:r>
           </w:p>
           <w:p>
@@ -454,7 +446,7 @@
               <w:pStyle w:val="ListBullet"/>
             </w:pPr>
             <w:r>
-              <w:t>Business process improvement</w:t>
+              <w:t>Business Process Improvement</w:t>
             </w:r>
           </w:p>
           <w:p>
@@ -462,7 +454,7 @@
               <w:pStyle w:val="ListBullet"/>
             </w:pPr>
             <w:r>
-              <w:t>Operational excellence</w:t>
+              <w:t>Financial Analysis</w:t>
             </w:r>
           </w:p>
           <w:p>
@@ -470,7 +462,7 @@
               <w:pStyle w:val="ListBullet"/>
             </w:pPr>
             <w:r>
-              <w:t>Project coordination</w:t>
+              <w:t>Stakeholder Communication</w:t>
             </w:r>
           </w:p>
           <w:p>
@@ -478,7 +470,15 @@
               <w:pStyle w:val="ListBullet"/>
             </w:pPr>
             <w:r>
-              <w:t>Lean Six Sigma methodologies</w:t>
+              <w:t>Data Analytics</w:t>
+            </w:r>
+          </w:p>
+          <w:p>
+            <w:pPr>
+              <w:pStyle w:val="ListBullet"/>
+            </w:pPr>
+            <w:r>
+              <w:t>Lean Six Sigma Methodology</w:t>
             </w:r>
           </w:p>
           <w:p>
@@ -494,7 +494,7 @@
               <w:pStyle w:val="ListBullet"/>
             </w:pPr>
             <w:r>
-              <w:t>Client-facing roles</w:t>
+              <w:t>Client Engagement</w:t>
             </w:r>
           </w:p>
           <w:p>
@@ -502,7 +502,7 @@
               <w:pStyle w:val="ListBullet"/>
             </w:pPr>
             <w:r>
-              <w:t>Financial analysis</w:t>
+              <w:t>Customer Service</w:t>
             </w:r>
           </w:p>
           <w:p>
@@ -510,7 +510,7 @@
               <w:pStyle w:val="ListBullet"/>
             </w:pPr>
             <w:r>
-              <w:t>Leadership and communication</w:t>
+              <w:t>Problem-solving</w:t>
             </w:r>
           </w:p>
           <w:p>
@@ -518,7 +518,7 @@
               <w:pStyle w:val="ListBullet"/>
             </w:pPr>
             <w:r>
-              <w:t>Analytical problem solving</w:t>
+              <w:t>Project Coordination</w:t>
             </w:r>
           </w:p>
           <w:p>
@@ -526,7 +526,7 @@
               <w:pStyle w:val="ListBullet"/>
             </w:pPr>
             <w:r>
-              <w:t>Data-driven decision-making</w:t>
+              <w:t>Team Leadership</w:t>
             </w:r>
           </w:p>
         </w:tc>
@@ -556,15 +556,7 @@
               <w:pStyle w:val="ListBullet"/>
             </w:pPr>
             <w:r>
-              <w:t>Customer service environments</w:t>
-            </w:r>
-          </w:p>
-          <w:p>
-            <w:pPr>
-              <w:pStyle w:val="ListBullet"/>
-            </w:pPr>
-            <w:r>
-              <w:t>Collaborative team settings</w:t>
+              <w:t>Team-oriented settings</w:t>
             </w:r>
           </w:p>
           <w:p>
@@ -589,6 +581,22 @@
               <w:pStyle w:val="ListBullet"/>
             </w:pPr>
             <w:r>
+              <w:t>PowerPoint</w:t>
+            </w:r>
+          </w:p>
+          <w:p>
+            <w:pPr>
+              <w:pStyle w:val="ListBullet"/>
+            </w:pPr>
+            <w:r>
+              <w:t>Outlook</w:t>
+            </w:r>
+          </w:p>
+          <w:p>
+            <w:pPr>
+              <w:pStyle w:val="ListBullet"/>
+            </w:pPr>
+            <w:r>
               <w:t>Power BI</w:t>
             </w:r>
           </w:p>
@@ -597,15 +605,7 @@
               <w:pStyle w:val="ListBullet"/>
             </w:pPr>
             <w:r>
-              <w:t>Microsoft Outlook</w:t>
-            </w:r>
-          </w:p>
-          <w:p>
-            <w:pPr>
-              <w:pStyle w:val="ListBullet"/>
-            </w:pPr>
-            <w:r>
-              <w:t>Microsoft Excel</w:t>
+              <w:t>Excel</w:t>
             </w:r>
           </w:p>
           <w:p>
@@ -937,7 +937,7 @@
               <w:pStyle w:val="CV-TableHeading-Row"/>
             </w:pPr>
             <w:r>
-              <w:t>3</w:t>
+              <w:t>4</w:t>
             </w:r>
           </w:p>
         </w:tc>
@@ -1031,7 +1031,7 @@
               <w:pStyle w:val="CV-TableHeading-Row"/>
             </w:pPr>
             <w:r>
-              <w:t>Process Documentation</w:t>
+              <w:t>Lean Six Sigma methodologies</w:t>
             </w:r>
           </w:p>
         </w:tc>
@@ -1077,89 +1077,7 @@
               <w:pStyle w:val="CV-TableHeading-Row"/>
             </w:pPr>
             <w:r>
-              <w:t>Customer Journey Mapping</w:t>
-            </w:r>
-          </w:p>
-        </w:tc>
-        <w:tc>
-          <w:tcPr>
-            <w:tcW w:type="dxa" w:w="2197"/>
-          </w:tcPr>
-          <w:p>
-            <w:pPr>
-              <w:pStyle w:val="CV-TableHeading-Row"/>
-            </w:pPr>
-            <w:r>
-              <w:t>1</w:t>
-            </w:r>
-          </w:p>
-        </w:tc>
-        <w:tc>
-          <w:tcPr>
-            <w:tcW w:type="dxa" w:w="1675"/>
-          </w:tcPr>
-          <w:p>
-            <w:pPr>
-              <w:pStyle w:val="CV-TableHeading-Row"/>
-            </w:pPr>
-            <w:r>
-              <w:t>2</w:t>
-            </w:r>
-          </w:p>
-        </w:tc>
-      </w:tr>
-      <w:tr>
-        <w:tc>
-          <w:tcPr>
-            <w:tcW w:type="dxa" w:w="6318"/>
-          </w:tcPr>
-          <w:p>
-            <w:pPr>
-              <w:pStyle w:val="CV-TableHeading-Row"/>
-            </w:pPr>
-            <w:r>
-              <w:t>Organizational Design</w:t>
-            </w:r>
-          </w:p>
-        </w:tc>
-        <w:tc>
-          <w:tcPr>
-            <w:tcW w:type="dxa" w:w="2197"/>
-          </w:tcPr>
-          <w:p>
-            <w:pPr>
-              <w:pStyle w:val="CV-TableHeading-Row"/>
-            </w:pPr>
-            <w:r>
-              <w:t>1</w:t>
-            </w:r>
-          </w:p>
-        </w:tc>
-        <w:tc>
-          <w:tcPr>
-            <w:tcW w:type="dxa" w:w="1675"/>
-          </w:tcPr>
-          <w:p>
-            <w:pPr>
-              <w:pStyle w:val="CV-TableHeading-Row"/>
-            </w:pPr>
-            <w:r>
-              <w:t>2</w:t>
-            </w:r>
-          </w:p>
-        </w:tc>
-      </w:tr>
-      <w:tr>
-        <w:tc>
-          <w:tcPr>
-            <w:tcW w:type="dxa" w:w="6318"/>
-          </w:tcPr>
-          <w:p>
-            <w:pPr>
-              <w:pStyle w:val="CV-TableHeading-Row"/>
-            </w:pPr>
-            <w:r>
-              <w:t>Operational Improvements</w:t>
+              <w:t>Business process improvement</w:t>
             </w:r>
           </w:p>
         </w:tc>
@@ -1225,7 +1143,7 @@
               <w:pStyle w:val="CV-TableHeading-Row"/>
             </w:pPr>
             <w:r>
-              <w:t>Business Process Improvement</w:t>
+              <w:t>Data analytics</w:t>
             </w:r>
           </w:p>
         </w:tc>
@@ -1271,7 +1189,7 @@
               <w:pStyle w:val="CV-TableHeading-Row"/>
             </w:pPr>
             <w:r>
-              <w:t>Lean Six Sigma</w:t>
+              <w:t>Process automation</w:t>
             </w:r>
           </w:p>
         </w:tc>
@@ -1312,7 +1230,7 @@
               <w:pStyle w:val="CV-TableHeading-Row"/>
             </w:pPr>
             <w:r>
-              <w:t>Data Analytics</w:t>
+              <w:t>Dashboard creation</w:t>
             </w:r>
           </w:p>
         </w:tc>
@@ -1325,7 +1243,7 @@
               <w:pStyle w:val="CV-TableHeading-Row"/>
             </w:pPr>
             <w:r>
-              <w:t>2</w:t>
+              <w:t>1</w:t>
             </w:r>
           </w:p>
         </w:tc>
@@ -1338,7 +1256,7 @@
               <w:pStyle w:val="CV-TableHeading-Row"/>
             </w:pPr>
             <w:r>
-              <w:t>3</w:t>
+              <w:t>2</w:t>
             </w:r>
           </w:p>
         </w:tc>
@@ -1392,7 +1310,7 @@
               <w:pStyle w:val="CV-TableHeading-Row"/>
             </w:pPr>
             <w:r>
-              <w:t>8</w:t>
+              <w:t>7</w:t>
             </w:r>
           </w:p>
         </w:tc>
@@ -1424,7 +1342,7 @@
               <w:pStyle w:val="CV-TableHeading-Row"/>
             </w:pPr>
             <w:r>
-              <w:t>Government Operations</w:t>
+              <w:t>Government operations</w:t>
             </w:r>
           </w:p>
         </w:tc>
@@ -1437,7 +1355,7 @@
               <w:pStyle w:val="CV-TableHeading-Row"/>
             </w:pPr>
             <w:r>
-              <w:t>2</w:t>
+              <w:t>1</w:t>
             </w:r>
           </w:p>
         </w:tc>
@@ -1450,7 +1368,7 @@
               <w:pStyle w:val="CV-TableHeading-Row"/>
             </w:pPr>
             <w:r>
-              <w:t>3</w:t>
+              <w:t>2</w:t>
             </w:r>
           </w:p>
         </w:tc>
@@ -1465,7 +1383,7 @@
               <w:pStyle w:val="CV-TableHeading-Row"/>
             </w:pPr>
             <w:r>
-              <w:t>Financial Management</w:t>
+              <w:t>Business consulting</w:t>
             </w:r>
           </w:p>
         </w:tc>
@@ -1531,7 +1449,7 @@
               <w:pStyle w:val="CV-TableHeading-Row"/>
             </w:pPr>
             <w:r>
-              <w:t>Leadership</w:t>
+              <w:t>Analytical and problem-solving skills</w:t>
             </w:r>
           </w:p>
         </w:tc>
@@ -1545,7 +1463,7 @@
               <w:pStyle w:val="CV-TableHeading-Row"/>
             </w:pPr>
             <w:r>
-              <w:t>8</w:t>
+              <w:t>3</w:t>
             </w:r>
           </w:p>
         </w:tc>
@@ -1562,7 +1480,7 @@
               </w:rPr>
             </w:pPr>
             <w:r>
-              <w:t>4</w:t>
+              <w:t>3</w:t>
             </w:r>
           </w:p>
         </w:tc>
@@ -1577,7 +1495,7 @@
               <w:pStyle w:val="CV-TableHeading-Row"/>
             </w:pPr>
             <w:r>
-              <w:t>Communication</w:t>
+              <w:t>Leadership and team management</w:t>
             </w:r>
           </w:p>
         </w:tc>
@@ -1590,7 +1508,7 @@
               <w:pStyle w:val="CV-TableHeading-Row"/>
             </w:pPr>
             <w:r>
-              <w:t>9</w:t>
+              <w:t>5</w:t>
             </w:r>
           </w:p>
         </w:tc>
@@ -1603,7 +1521,7 @@
               <w:pStyle w:val="CV-TableHeading-Row"/>
             </w:pPr>
             <w:r>
-              <w:t>4</w:t>
+              <w:t>3</w:t>
             </w:r>
           </w:p>
         </w:tc>
@@ -1618,7 +1536,7 @@
               <w:pStyle w:val="CV-TableHeading-Row"/>
             </w:pPr>
             <w:r>
-              <w:t>Problem Solving</w:t>
+              <w:t>Customer service</w:t>
             </w:r>
           </w:p>
         </w:tc>
@@ -1631,7 +1549,7 @@
               <w:pStyle w:val="CV-TableHeading-Row"/>
             </w:pPr>
             <w:r>
-              <w:t>9</w:t>
+              <w:t>7</w:t>
             </w:r>
           </w:p>
         </w:tc>
@@ -1659,7 +1577,7 @@
               <w:pStyle w:val="CV-TableHeading-Row"/>
             </w:pPr>
             <w:r>
-              <w:t>Interpersonal Skills</w:t>
+              <w:t>Event planning and coordination</w:t>
             </w:r>
           </w:p>
         </w:tc>
@@ -1672,7 +1590,7 @@
               <w:pStyle w:val="CV-TableHeading-Row"/>
             </w:pPr>
             <w:r>
-              <w:t>9</w:t>
+              <w:t>1</w:t>
             </w:r>
           </w:p>
         </w:tc>
@@ -1685,48 +1603,7 @@
               <w:pStyle w:val="CV-TableHeading-Row"/>
             </w:pPr>
             <w:r>
-              <w:t>4</w:t>
-            </w:r>
-          </w:p>
-        </w:tc>
-      </w:tr>
-      <w:tr>
-        <w:tc>
-          <w:tcPr>
-            <w:tcW w:type="dxa" w:w="6318"/>
-          </w:tcPr>
-          <w:p>
-            <w:pPr>
-              <w:pStyle w:val="CV-TableHeading-Row"/>
-            </w:pPr>
-            <w:r>
-              <w:t>Team Coordination</w:t>
-            </w:r>
-          </w:p>
-        </w:tc>
-        <w:tc>
-          <w:tcPr>
-            <w:tcW w:type="dxa" w:w="2197"/>
-          </w:tcPr>
-          <w:p>
-            <w:pPr>
-              <w:pStyle w:val="CV-TableHeading-Row"/>
-            </w:pPr>
-            <w:r>
-              <w:t>8</w:t>
-            </w:r>
-          </w:p>
-        </w:tc>
-        <w:tc>
-          <w:tcPr>
-            <w:tcW w:type="dxa" w:w="1675"/>
-          </w:tcPr>
-          <w:p>
-            <w:pPr>
-              <w:pStyle w:val="CV-TableHeading-Row"/>
-            </w:pPr>
-            <w:r>
-              <w:t>4</w:t>
+              <w:t>2</w:t>
             </w:r>
           </w:p>
         </w:tc>

</xml_diff>